<commit_message>
002 2.1: columnas del eje 3 en HSST10X6X0.188 (medida par)
El HSS 9x9 no existe comercialmente; el HSST10X6X0.188 es el HSS de medidas
pares mas ligero que pasa (mismo peso que el 8x8x3/16, con mas holgura en
flecha). Factores X 1.1213 / Z 1.4625, CUT OFF 42. 7470.6 kg, 48.64 kg/m2
con 5% de conexiones. Desglose y hoja de sismo actualizados.

Co-Authored-By: Claude Opus 5.5 <noreply@anthropic.com>
Claude-Session: https://claude.ai/code/session_01DbpSpoM7qi5cJ9LMKpwgVv
</commit_message>
<xml_diff>
--- a/002/002_DESTRUCTURAL_H5H6_2.1.docx
+++ b/002/002_DESTRUCTURAL_H5H6_2.1.docx
@@ -263,7 +263,7 @@
                 <w:i w:val="0"/>
                 <w:sz w:val="17"/>
               </w:rPr>
-              <w:t>7,346.43 kg</w:t>
+              <w:t>7,470.63 kg</w:t>
             </w:r>
           </w:p>
         </w:tc>
@@ -349,7 +349,7 @@
                 <w:i w:val="0"/>
                 <w:sz w:val="17"/>
               </w:rPr>
-              <w:t>367.32 kg</w:t>
+              <w:t>373.53 kg</w:t>
             </w:r>
           </w:p>
         </w:tc>
@@ -395,7 +395,7 @@
                 <w:i w:val="0"/>
                 <w:sz w:val="17"/>
               </w:rPr>
-              <w:t>7,713.75 kg</w:t>
+              <w:t>7,844.16 kg</w:t>
             </w:r>
           </w:p>
         </w:tc>
@@ -439,7 +439,7 @@
                 <w:i w:val="0"/>
                 <w:sz w:val="17"/>
               </w:rPr>
-              <w:t>47.83 kg/m²</w:t>
+              <w:t>48.64 kg/m²</w:t>
             </w:r>
           </w:p>
         </w:tc>
@@ -525,7 +525,7 @@
                 <w:i w:val="0"/>
                 <w:sz w:val="17"/>
               </w:rPr>
-              <w:t>91.03 %</w:t>
+              <w:t>90.96 %</w:t>
             </w:r>
           </w:p>
         </w:tc>
@@ -569,7 +569,7 @@
                 <w:i w:val="0"/>
                 <w:sz w:val="17"/>
               </w:rPr>
-              <w:t>92.70 %</w:t>
+              <w:t>92.58 %</w:t>
             </w:r>
           </w:p>
         </w:tc>
@@ -655,7 +655,7 @@
                 <w:i w:val="0"/>
                 <w:sz w:val="17"/>
               </w:rPr>
-              <w:t>1.1191</w:t>
+              <w:t>1.1213</w:t>
             </w:r>
           </w:p>
         </w:tc>
@@ -697,7 +697,7 @@
                 <w:i w:val="0"/>
                 <w:sz w:val="17"/>
               </w:rPr>
-              <w:t>1.4664</w:t>
+              <w:t>1.4625</w:t>
             </w:r>
           </w:p>
         </w:tc>
@@ -801,7 +801,7 @@
           <w:i/>
           <w:sz w:val="16"/>
         </w:rPr>
-        <w:t>Peso de elementos: longitudes del modelo × peso unitario de cada sección (mismo criterio que el STEEL MEMBER TAKE OFF de STAAD, con todos los miembros). Conexiones: 5 %. Factores del espectro de la hoja de sismo con el peso dinámico de 13,076.56 kg (modos del motor de análisis; se confirman con la corrida de STAAD).</w:t>
+        <w:t>Peso de elementos: longitudes del modelo × peso unitario de cada sección (mismo criterio que el STEEL MEMBER TAKE OFF de STAAD, con todos los miembros). Conexiones: 5 %. Factores del espectro de la hoja de sismo con el peso dinámico de 13,196.88 kg (modos del motor de análisis; se confirman con la corrida de STAAD).</w:t>
       </w:r>
     </w:p>
     <w:p>
@@ -831,7 +831,7 @@
           <w:i w:val="0"/>
           <w:sz w:val="17"/>
         </w:rPr>
-        <w:t>•  Columnas HSS en 3 pares: eje 1 HSST12X8X0.25, eje 2 HSST16X8X0.25, eje 3 HSST9X9X0.125.</w:t>
+        <w:t>•  Columnas HSS en 3 pares: eje 1 HSST12X8X0.25, eje 2 HSST16X8X0.25, eje 3 HSST10X6X0.188.</w:t>
       </w:r>
     </w:p>
     <w:p>
@@ -921,7 +921,7 @@
           <w:i w:val="0"/>
           <w:sz w:val="17"/>
         </w:rPr>
-        <w:t>•  Revisión: ratio máximo 0.96, flecha máxima 0.89 de L/180 y deriva máxima 0.0177 (≤ 0.020 con Cd = 6); CUT OFF MODE SHAPE 42.</w:t>
+        <w:t>•  Revisión: ratio máximo 0.96, flecha máxima 0.89 de L/180 y deriva máxima 0.0179 (≤ 0.020 con Cd = 6); CUT OFF MODE SHAPE 42.</w:t>
       </w:r>
     </w:p>
     <w:p>
@@ -1291,7 +1291,7 @@
                 <w:i w:val="0"/>
                 <w:sz w:val="17"/>
               </w:rPr>
-              <w:t>40.98%</w:t>
+              <w:t>39.14%</w:t>
             </w:r>
           </w:p>
         </w:tc>
@@ -1419,7 +1419,7 @@
                 <w:i w:val="0"/>
                 <w:sz w:val="17"/>
               </w:rPr>
-              <w:t>35.78%</w:t>
+              <w:t>34.17%</w:t>
             </w:r>
           </w:p>
         </w:tc>
@@ -1442,7 +1442,7 @@
                 <w:i w:val="0"/>
                 <w:sz w:val="17"/>
               </w:rPr>
-              <w:t>HSST9X9X0.125</w:t>
+              <w:t>HSST10X6X0.188</w:t>
             </w:r>
           </w:p>
         </w:tc>
@@ -1463,7 +1463,7 @@
                 <w:i w:val="0"/>
                 <w:sz w:val="17"/>
               </w:rPr>
-              <w:t>HSS 9"x9"x1/8" - columnas eje 3</w:t>
+              <w:t>HSS 10"x6"x3/16" - columnas eje 3</w:t>
             </w:r>
           </w:p>
         </w:tc>
@@ -1505,7 +1505,7 @@
                 <w:i w:val="0"/>
                 <w:sz w:val="17"/>
               </w:rPr>
-              <w:t>20.67</w:t>
+              <w:t>27.14</w:t>
             </w:r>
           </w:p>
         </w:tc>
@@ -1526,7 +1526,7 @@
                 <w:i w:val="0"/>
                 <w:sz w:val="17"/>
               </w:rPr>
-              <w:t>396.87</w:t>
+              <w:t>521.07</w:t>
             </w:r>
           </w:p>
         </w:tc>
@@ -1547,7 +1547,7 @@
                 <w:i w:val="0"/>
                 <w:sz w:val="17"/>
               </w:rPr>
-              <w:t>15.03%</w:t>
+              <w:t>18.85%</w:t>
             </w:r>
           </w:p>
         </w:tc>
@@ -1675,7 +1675,7 @@
                 <w:i w:val="0"/>
                 <w:sz w:val="17"/>
               </w:rPr>
-              <w:t>6.72%</w:t>
+              <w:t>6.42%</w:t>
             </w:r>
           </w:p>
         </w:tc>
@@ -1803,7 +1803,7 @@
                 <w:i w:val="0"/>
                 <w:sz w:val="17"/>
               </w:rPr>
-              <w:t>1.49%</w:t>
+              <w:t>1.43%</w:t>
             </w:r>
           </w:p>
         </w:tc>
@@ -1934,7 +1934,7 @@
                 <w:i w:val="0"/>
                 <w:sz w:val="17"/>
               </w:rPr>
-              <w:t>2,640.19 kg</w:t>
+              <w:t>2,764.40 kg</w:t>
             </w:r>
           </w:p>
         </w:tc>
@@ -1978,7 +1978,7 @@
                 <w:i w:val="0"/>
                 <w:sz w:val="17"/>
               </w:rPr>
-              <w:t>132.01 kg</w:t>
+              <w:t>138.22 kg</w:t>
             </w:r>
           </w:p>
         </w:tc>
@@ -2022,7 +2022,7 @@
                 <w:i w:val="0"/>
                 <w:sz w:val="17"/>
               </w:rPr>
-              <w:t>2,772.20 kg</w:t>
+              <w:t>2,902.61 kg</w:t>
             </w:r>
           </w:p>
         </w:tc>
@@ -2112,7 +2112,7 @@
                 <w:i w:val="0"/>
                 <w:sz w:val="17"/>
               </w:rPr>
-              <w:t>17.19 kg/m²</w:t>
+              <w:t>18.00 kg/m²</w:t>
             </w:r>
           </w:p>
         </w:tc>
@@ -7151,7 +7151,7 @@
                 <w:i w:val="0"/>
                 <w:sz w:val="17"/>
               </w:rPr>
-              <w:t>2,640.19</w:t>
+              <w:t>2,764.40</w:t>
             </w:r>
           </w:p>
         </w:tc>
@@ -7172,7 +7172,7 @@
                 <w:i w:val="0"/>
                 <w:sz w:val="17"/>
               </w:rPr>
-              <w:t>132.01</w:t>
+              <w:t>138.22</w:t>
             </w:r>
           </w:p>
         </w:tc>
@@ -7193,7 +7193,7 @@
                 <w:i w:val="0"/>
                 <w:sz w:val="17"/>
               </w:rPr>
-              <w:t>2,772.20</w:t>
+              <w:t>2,902.61</w:t>
             </w:r>
           </w:p>
         </w:tc>
@@ -7214,7 +7214,7 @@
                 <w:i w:val="0"/>
                 <w:sz w:val="17"/>
               </w:rPr>
-              <w:t>17.19</w:t>
+              <w:t>18.00</w:t>
             </w:r>
           </w:p>
         </w:tc>
@@ -7795,7 +7795,7 @@
                 <w:i w:val="0"/>
                 <w:sz w:val="17"/>
               </w:rPr>
-              <w:t>7,346.43</w:t>
+              <w:t>7,470.63</w:t>
             </w:r>
           </w:p>
         </w:tc>
@@ -7817,7 +7817,7 @@
                 <w:i w:val="0"/>
                 <w:sz w:val="17"/>
               </w:rPr>
-              <w:t>367.32</w:t>
+              <w:t>373.53</w:t>
             </w:r>
           </w:p>
         </w:tc>
@@ -7839,7 +7839,7 @@
                 <w:i w:val="0"/>
                 <w:sz w:val="17"/>
               </w:rPr>
-              <w:t>7,713.75</w:t>
+              <w:t>7,844.16</w:t>
             </w:r>
           </w:p>
         </w:tc>
@@ -7861,7 +7861,7 @@
                 <w:i w:val="0"/>
                 <w:sz w:val="17"/>
               </w:rPr>
-              <w:t>47.83</w:t>
+              <w:t>48.64</w:t>
             </w:r>
           </w:p>
         </w:tc>
@@ -7992,7 +7992,7 @@
                 <w:i w:val="0"/>
                 <w:sz w:val="17"/>
               </w:rPr>
-              <w:t>7,346.43 kg</w:t>
+              <w:t>7,470.63 kg</w:t>
             </w:r>
           </w:p>
         </w:tc>
@@ -8036,7 +8036,7 @@
                 <w:i w:val="0"/>
                 <w:sz w:val="17"/>
               </w:rPr>
-              <w:t>367.32 kg</w:t>
+              <w:t>373.53 kg</w:t>
             </w:r>
           </w:p>
         </w:tc>
@@ -8082,7 +8082,7 @@
                 <w:i w:val="0"/>
                 <w:sz w:val="17"/>
               </w:rPr>
-              <w:t>7,713.75 kg</w:t>
+              <w:t>7,844.16 kg</w:t>
             </w:r>
           </w:p>
         </w:tc>
@@ -8172,7 +8172,7 @@
                 <w:i w:val="0"/>
                 <w:sz w:val="17"/>
               </w:rPr>
-              <w:t>47.83 kg/m²</w:t>
+              <w:t>48.64 kg/m²</w:t>
             </w:r>
           </w:p>
         </w:tc>

</xml_diff>

<commit_message>
002 2.1: columnas HSS cuadradas de medida par
Columnas eje 1 HSST12X12X0.25, eje 2 HSST10X10X0.313, eje 3 HSST8X8X0.188.
Con la columna cuadrada la viga de marco del eje 2 toma mas momento de
viento y pasa a MCE12-14; el larguero de techo LT-5 pasa a MC12-12.
CUT OFF 46, factores X 1.1531 / Z 1.3975. 7751.0 kg, 50.46 kg/m2 con 5%
de conexiones. El desglose ya no deja la hoja en blanco despues de la
configuracion.

Co-Authored-By: Claude Opus 5.5 <noreply@anthropic.com>
Claude-Session: https://claude.ai/code/session_01DbpSpoM7qi5cJ9LMKpwgVv
</commit_message>
<xml_diff>
--- a/002/002_DESTRUCTURAL_H5H6_2.1.docx
+++ b/002/002_DESTRUCTURAL_H5H6_2.1.docx
@@ -263,7 +263,7 @@
                 <w:i w:val="0"/>
                 <w:sz w:val="17"/>
               </w:rPr>
-              <w:t>7,470.63 kg</w:t>
+              <w:t>7,751.01 kg</w:t>
             </w:r>
           </w:p>
         </w:tc>
@@ -349,7 +349,7 @@
                 <w:i w:val="0"/>
                 <w:sz w:val="17"/>
               </w:rPr>
-              <w:t>373.53 kg</w:t>
+              <w:t>387.55 kg</w:t>
             </w:r>
           </w:p>
         </w:tc>
@@ -395,7 +395,7 @@
                 <w:i w:val="0"/>
                 <w:sz w:val="17"/>
               </w:rPr>
-              <w:t>7,844.16 kg</w:t>
+              <w:t>8,138.56 kg</w:t>
             </w:r>
           </w:p>
         </w:tc>
@@ -439,7 +439,7 @@
                 <w:i w:val="0"/>
                 <w:sz w:val="17"/>
               </w:rPr>
-              <w:t>48.64 kg/m²</w:t>
+              <w:t>50.46 kg/m²</w:t>
             </w:r>
           </w:p>
         </w:tc>
@@ -483,7 +483,7 @@
                 <w:i w:val="0"/>
                 <w:sz w:val="17"/>
               </w:rPr>
-              <w:t>42</w:t>
+              <w:t>46</w:t>
             </w:r>
           </w:p>
         </w:tc>
@@ -525,7 +525,7 @@
                 <w:i w:val="0"/>
                 <w:sz w:val="17"/>
               </w:rPr>
-              <w:t>90.96 %</w:t>
+              <w:t>91.69 %</w:t>
             </w:r>
           </w:p>
         </w:tc>
@@ -569,7 +569,7 @@
                 <w:i w:val="0"/>
                 <w:sz w:val="17"/>
               </w:rPr>
-              <w:t>92.58 %</w:t>
+              <w:t>92.48 %</w:t>
             </w:r>
           </w:p>
         </w:tc>
@@ -655,7 +655,7 @@
                 <w:i w:val="0"/>
                 <w:sz w:val="17"/>
               </w:rPr>
-              <w:t>1.1213</w:t>
+              <w:t>1.1531</w:t>
             </w:r>
           </w:p>
         </w:tc>
@@ -697,7 +697,7 @@
                 <w:i w:val="0"/>
                 <w:sz w:val="17"/>
               </w:rPr>
-              <w:t>1.4625</w:t>
+              <w:t>1.3975</w:t>
             </w:r>
           </w:p>
         </w:tc>
@@ -801,7 +801,7 @@
           <w:i/>
           <w:sz w:val="16"/>
         </w:rPr>
-        <w:t>Peso de elementos: longitudes del modelo × peso unitario de cada sección (mismo criterio que el STEEL MEMBER TAKE OFF de STAAD, con todos los miembros). Conexiones: 5 %. Factores del espectro de la hoja de sismo con el peso dinámico de 13,196.88 kg (modos del motor de análisis; se confirman con la corrida de STAAD).</w:t>
+        <w:t>Peso de elementos: longitudes del modelo × peso unitario de cada sección (mismo criterio que el STEEL MEMBER TAKE OFF de STAAD, con todos los miembros). Conexiones: 5 %. Factores del espectro de la hoja de sismo con el peso dinámico de 13,470.77 kg (modos del motor de análisis; se confirman con la corrida de STAAD).</w:t>
       </w:r>
     </w:p>
     <w:p>
@@ -831,7 +831,7 @@
           <w:i w:val="0"/>
           <w:sz w:val="17"/>
         </w:rPr>
-        <w:t>•  Columnas HSS en 3 pares: eje 1 HSST12X8X0.25, eje 2 HSST16X8X0.25, eje 3 HSST10X6X0.188.</w:t>
+        <w:t>•  Columnas HSS en 3 pares: eje 1 HSST12X12X0.25, eje 2 HSST10X10X0.313, eje 3 HSST8X8X0.188.</w:t>
       </w:r>
     </w:p>
     <w:p>
@@ -846,7 +846,7 @@
           <w:i w:val="0"/>
           <w:sz w:val="17"/>
         </w:rPr>
-        <w:t>•  Vigas de marco espalda con espalda: eje 1 MCE4-14, eje 2 MCE6-12, eje 3 MCE5-14; dinteles MCC10-14; vigas de alero MCE12-14.</w:t>
+        <w:t>•  Vigas de marco espalda con espalda: eje 1 MCE4-14, eje 2 MCE12-14, eje 3 MCE5-14; dinteles MCC10-14; vigas de alero MCE12-14.</w:t>
       </w:r>
     </w:p>
     <w:p>
@@ -861,7 +861,7 @@
           <w:i w:val="0"/>
           <w:sz w:val="17"/>
         </w:rPr>
-        <w:t>•  Largueros de techo de 12": MC12-14 (LT-1, LT-2, LT-3, LT-4, LT-5, LT-6, LT-7, LT-9); MC12-12 (LT-8).</w:t>
+        <w:t>•  Largueros de techo de 12": MC12-14 (LT-1, LT-2, LT-3, LT-4, LT-6, LT-7, LT-9); MC12-12 (LT-5, LT-8).</w:t>
       </w:r>
     </w:p>
     <w:p>
@@ -921,7 +921,7 @@
           <w:i w:val="0"/>
           <w:sz w:val="17"/>
         </w:rPr>
-        <w:t>•  Revisión: ratio máximo 0.96, flecha máxima 0.89 de L/180 y deriva máxima 0.0179 (≤ 0.020 con Cd = 6); CUT OFF MODE SHAPE 42.</w:t>
+        <w:t>•  Revisión: ratio máximo 0.97, flecha máxima 0.89 de L/180 y deriva máxima 0.0186 (≤ 0.020 con Cd = 6); CUT OFF MODE SHAPE 46.</w:t>
       </w:r>
     </w:p>
     <w:p>
@@ -981,12 +981,8 @@
       </w:r>
     </w:p>
     <w:p>
-      <w:r>
-        <w:br w:type="page"/>
-      </w:r>
-    </w:p>
-    <w:p>
-      <w:pPr>
+      <w:pPr>
+        <w:pageBreakBefore/>
         <w:spacing w:before="160" w:after="80"/>
         <w:jc w:val="left"/>
       </w:pPr>
@@ -1186,7 +1182,7 @@
                 <w:i w:val="0"/>
                 <w:sz w:val="17"/>
               </w:rPr>
-              <w:t>HSST16X8X0.25</w:t>
+              <w:t>HSST12X12X0.25</w:t>
             </w:r>
           </w:p>
         </w:tc>
@@ -1207,7 +1203,7 @@
                 <w:i w:val="0"/>
                 <w:sz w:val="17"/>
               </w:rPr>
-              <w:t>HSS 16"x8"x1/4" - columnas eje 2</w:t>
+              <w:t>HSS 12"x12"x1/4" - columnas eje 1</w:t>
             </w:r>
           </w:p>
         </w:tc>
@@ -1228,7 +1224,7 @@
                 <w:i w:val="0"/>
                 <w:sz w:val="17"/>
               </w:rPr>
-              <w:t>19.82</w:t>
+              <w:t>20.86</w:t>
             </w:r>
           </w:p>
         </w:tc>
@@ -1270,7 +1266,7 @@
                 <w:i w:val="0"/>
                 <w:sz w:val="17"/>
               </w:rPr>
-              <w:t>1,081.93</w:t>
+              <w:t>1,138.56</w:t>
             </w:r>
           </w:p>
         </w:tc>
@@ -1291,7 +1287,7 @@
                 <w:i w:val="0"/>
                 <w:sz w:val="17"/>
               </w:rPr>
-              <w:t>39.14%</w:t>
+              <w:t>38.10%</w:t>
             </w:r>
           </w:p>
         </w:tc>
@@ -1314,7 +1310,7 @@
                 <w:i w:val="0"/>
                 <w:sz w:val="17"/>
               </w:rPr>
-              <w:t>HSST12X8X0.25</w:t>
+              <w:t>HSST10X10X0.313</w:t>
             </w:r>
           </w:p>
         </w:tc>
@@ -1335,7 +1331,7 @@
                 <w:i w:val="0"/>
                 <w:sz w:val="17"/>
               </w:rPr>
-              <w:t>HSS 12"x8"x1/4" - columnas eje 1</w:t>
+              <w:t>HSS 10"x10"x5/16" - columnas eje 2</w:t>
             </w:r>
           </w:p>
         </w:tc>
@@ -1356,7 +1352,7 @@
                 <w:i w:val="0"/>
                 <w:sz w:val="17"/>
               </w:rPr>
-              <w:t>20.86</w:t>
+              <w:t>19.82</w:t>
             </w:r>
           </w:p>
         </w:tc>
@@ -1377,7 +1373,7 @@
                 <w:i w:val="0"/>
                 <w:sz w:val="17"/>
               </w:rPr>
-              <w:t>45.28</w:t>
+              <w:t>56.10</w:t>
             </w:r>
           </w:p>
         </w:tc>
@@ -1398,7 +1394,7 @@
                 <w:i w:val="0"/>
                 <w:sz w:val="17"/>
               </w:rPr>
-              <w:t>944.58</w:t>
+              <w:t>1,111.99</w:t>
             </w:r>
           </w:p>
         </w:tc>
@@ -1419,7 +1415,7 @@
                 <w:i w:val="0"/>
                 <w:sz w:val="17"/>
               </w:rPr>
-              <w:t>34.17%</w:t>
+              <w:t>37.21%</w:t>
             </w:r>
           </w:p>
         </w:tc>
@@ -1442,7 +1438,7 @@
                 <w:i w:val="0"/>
                 <w:sz w:val="17"/>
               </w:rPr>
-              <w:t>HSST10X6X0.188</w:t>
+              <w:t>HSST8X8X0.188</w:t>
             </w:r>
           </w:p>
         </w:tc>
@@ -1463,7 +1459,7 @@
                 <w:i w:val="0"/>
                 <w:sz w:val="17"/>
               </w:rPr>
-              <w:t>HSS 10"x6"x3/16" - columnas eje 3</w:t>
+              <w:t>HSS 8"x8"x3/16" - columnas eje 3</w:t>
             </w:r>
           </w:p>
         </w:tc>
@@ -1547,7 +1543,7 @@
                 <w:i w:val="0"/>
                 <w:sz w:val="17"/>
               </w:rPr>
-              <w:t>18.85%</w:t>
+              <w:t>17.44%</w:t>
             </w:r>
           </w:p>
         </w:tc>
@@ -1675,7 +1671,7 @@
                 <w:i w:val="0"/>
                 <w:sz w:val="17"/>
               </w:rPr>
-              <w:t>6.42%</w:t>
+              <w:t>5.94%</w:t>
             </w:r>
           </w:p>
         </w:tc>
@@ -1803,7 +1799,7 @@
                 <w:i w:val="0"/>
                 <w:sz w:val="17"/>
               </w:rPr>
-              <w:t>1.43%</w:t>
+              <w:t>1.32%</w:t>
             </w:r>
           </w:p>
         </w:tc>
@@ -1934,7 +1930,7 @@
                 <w:i w:val="0"/>
                 <w:sz w:val="17"/>
               </w:rPr>
-              <w:t>2,764.40 kg</w:t>
+              <w:t>2,988.43 kg</w:t>
             </w:r>
           </w:p>
         </w:tc>
@@ -1978,7 +1974,7 @@
                 <w:i w:val="0"/>
                 <w:sz w:val="17"/>
               </w:rPr>
-              <w:t>138.22 kg</w:t>
+              <w:t>149.42 kg</w:t>
             </w:r>
           </w:p>
         </w:tc>
@@ -2022,7 +2018,7 @@
                 <w:i w:val="0"/>
                 <w:sz w:val="17"/>
               </w:rPr>
-              <w:t>2,902.61 kg</w:t>
+              <w:t>3,137.85 kg</w:t>
             </w:r>
           </w:p>
         </w:tc>
@@ -2112,7 +2108,7 @@
                 <w:i w:val="0"/>
                 <w:sz w:val="17"/>
               </w:rPr>
-              <w:t>18.00 kg/m²</w:t>
+              <w:t>19.46 kg/m²</w:t>
             </w:r>
           </w:p>
         </w:tc>
@@ -2189,12 +2185,8 @@
       </w:r>
     </w:p>
     <w:p>
-      <w:r>
-        <w:br w:type="page"/>
-      </w:r>
-    </w:p>
-    <w:p>
-      <w:pPr>
+      <w:pPr>
+        <w:pageBreakBefore/>
         <w:spacing w:before="160" w:after="80"/>
         <w:jc w:val="left"/>
       </w:pPr>
@@ -2415,7 +2407,7 @@
                 <w:i w:val="0"/>
                 <w:sz w:val="17"/>
               </w:rPr>
-              <w:t>Montén doble 12" cal. 14 - vigas de alero claro 1-2</w:t>
+              <w:t>Montén doble 12" cal. 14 - viga de marco eje 2, vigas de alero claro 1-2</w:t>
             </w:r>
           </w:p>
         </w:tc>
@@ -2436,7 +2428,7 @@
                 <w:i w:val="0"/>
                 <w:sz w:val="17"/>
               </w:rPr>
-              <w:t>32.04</w:t>
+              <w:t>42.12</w:t>
             </w:r>
           </w:p>
         </w:tc>
@@ -2478,7 +2470,7 @@
                 <w:i w:val="0"/>
                 <w:sz w:val="17"/>
               </w:rPr>
-              <w:t>463.99</w:t>
+              <w:t>609.95</w:t>
             </w:r>
           </w:p>
         </w:tc>
@@ -2499,7 +2491,7 @@
                 <w:i w:val="0"/>
                 <w:sz w:val="17"/>
               </w:rPr>
-              <w:t>64.93%</w:t>
+              <w:t>82.20%</w:t>
             </w:r>
           </w:p>
         </w:tc>
@@ -2522,7 +2514,7 @@
                 <w:i w:val="0"/>
                 <w:sz w:val="17"/>
               </w:rPr>
-              <w:t>MCE6-12</w:t>
+              <w:t>MCE5-14</w:t>
             </w:r>
           </w:p>
         </w:tc>
@@ -2543,7 +2535,7 @@
                 <w:i w:val="0"/>
                 <w:sz w:val="17"/>
               </w:rPr>
-              <w:t>Montén doble 6" cal. 12 - viga de marco eje 2</w:t>
+              <w:t>Montén doble 5" cal. 14 - viga de marco eje 3</w:t>
             </w:r>
           </w:p>
         </w:tc>
@@ -2585,7 +2577,7 @@
                 <w:i w:val="0"/>
                 <w:sz w:val="17"/>
               </w:rPr>
-              <w:t>11.76</w:t>
+              <w:t>6.93</w:t>
             </w:r>
           </w:p>
         </w:tc>
@@ -2606,7 +2598,7 @@
                 <w:i w:val="0"/>
                 <w:sz w:val="17"/>
               </w:rPr>
-              <w:t>118.54</w:t>
+              <w:t>69.87</w:t>
             </w:r>
           </w:p>
         </w:tc>
@@ -2627,7 +2619,7 @@
                 <w:i w:val="0"/>
                 <w:sz w:val="17"/>
               </w:rPr>
-              <w:t>16.59%</w:t>
+              <w:t>9.42%</w:t>
             </w:r>
           </w:p>
         </w:tc>
@@ -2650,7 +2642,7 @@
                 <w:i w:val="0"/>
                 <w:sz w:val="17"/>
               </w:rPr>
-              <w:t>MCE5-14</w:t>
+              <w:t>MCE4-14</w:t>
             </w:r>
           </w:p>
         </w:tc>
@@ -2671,7 +2663,7 @@
                 <w:i w:val="0"/>
                 <w:sz w:val="17"/>
               </w:rPr>
-              <w:t>Montén doble 5" cal. 14 - viga de marco eje 3</w:t>
+              <w:t>Montén doble 4" cal. 14 - viga de marco eje 1</w:t>
             </w:r>
           </w:p>
         </w:tc>
@@ -2713,7 +2705,7 @@
                 <w:i w:val="0"/>
                 <w:sz w:val="17"/>
               </w:rPr>
-              <w:t>6.93</w:t>
+              <w:t>6.18</w:t>
             </w:r>
           </w:p>
         </w:tc>
@@ -2734,7 +2726,7 @@
                 <w:i w:val="0"/>
                 <w:sz w:val="17"/>
               </w:rPr>
-              <w:t>69.87</w:t>
+              <w:t>62.26</w:t>
             </w:r>
           </w:p>
         </w:tc>
@@ -2755,135 +2747,7 @@
                 <w:i w:val="0"/>
                 <w:sz w:val="17"/>
               </w:rPr>
-              <w:t>9.78%</w:t>
-            </w:r>
-          </w:p>
-        </w:tc>
-      </w:tr>
-      <w:tr>
-        <w:tc>
-          <w:tcPr>
-            <w:tcW w:type="dxa" w:w="1701"/>
-          </w:tcPr>
-          <w:p>
-            <w:pPr>
-              <w:spacing w:before="20" w:after="20"/>
-              <w:jc w:val="left"/>
-            </w:pPr>
-            <w:r/>
-            <w:r>
-              <w:rPr>
-                <w:rFonts w:ascii="Arial" w:hAnsi="Arial" w:cs="Arial"/>
-                <w:b w:val="0"/>
-                <w:i w:val="0"/>
-                <w:sz w:val="17"/>
-              </w:rPr>
-              <w:t>MCE4-14</w:t>
-            </w:r>
-          </w:p>
-        </w:tc>
-        <w:tc>
-          <w:tcPr>
-            <w:tcW w:type="dxa" w:w="3515"/>
-          </w:tcPr>
-          <w:p>
-            <w:pPr>
-              <w:spacing w:before="20" w:after="20"/>
-              <w:jc w:val="left"/>
-            </w:pPr>
-            <w:r/>
-            <w:r>
-              <w:rPr>
-                <w:rFonts w:ascii="Arial" w:hAnsi="Arial" w:cs="Arial"/>
-                <w:b w:val="0"/>
-                <w:i w:val="0"/>
-                <w:sz w:val="17"/>
-              </w:rPr>
-              <w:t>Montén doble 4" cal. 14 - viga de marco eje 1</w:t>
-            </w:r>
-          </w:p>
-        </w:tc>
-        <w:tc>
-          <w:tcPr>
-            <w:tcW w:type="dxa" w:w="1191"/>
-          </w:tcPr>
-          <w:p>
-            <w:pPr>
-              <w:spacing w:before="20" w:after="20"/>
-              <w:jc w:val="right"/>
-            </w:pPr>
-            <w:r/>
-            <w:r>
-              <w:rPr>
-                <w:rFonts w:ascii="Arial" w:hAnsi="Arial" w:cs="Arial"/>
-                <w:b w:val="0"/>
-                <w:i w:val="0"/>
-                <w:sz w:val="17"/>
-              </w:rPr>
-              <w:t>10.08</w:t>
-            </w:r>
-          </w:p>
-        </w:tc>
-        <w:tc>
-          <w:tcPr>
-            <w:tcW w:type="dxa" w:w="907"/>
-          </w:tcPr>
-          <w:p>
-            <w:pPr>
-              <w:spacing w:before="20" w:after="20"/>
-              <w:jc w:val="right"/>
-            </w:pPr>
-            <w:r/>
-            <w:r>
-              <w:rPr>
-                <w:rFonts w:ascii="Arial" w:hAnsi="Arial" w:cs="Arial"/>
-                <w:b w:val="0"/>
-                <w:i w:val="0"/>
-                <w:sz w:val="17"/>
-              </w:rPr>
-              <w:t>6.18</w:t>
-            </w:r>
-          </w:p>
-        </w:tc>
-        <w:tc>
-          <w:tcPr>
-            <w:tcW w:type="dxa" w:w="1191"/>
-          </w:tcPr>
-          <w:p>
-            <w:pPr>
-              <w:spacing w:before="20" w:after="20"/>
-              <w:jc w:val="right"/>
-            </w:pPr>
-            <w:r/>
-            <w:r>
-              <w:rPr>
-                <w:rFonts w:ascii="Arial" w:hAnsi="Arial" w:cs="Arial"/>
-                <w:b w:val="0"/>
-                <w:i w:val="0"/>
-                <w:sz w:val="17"/>
-              </w:rPr>
-              <w:t>62.26</w:t>
-            </w:r>
-          </w:p>
-        </w:tc>
-        <w:tc>
-          <w:tcPr>
-            <w:tcW w:type="dxa" w:w="794"/>
-          </w:tcPr>
-          <w:p>
-            <w:pPr>
-              <w:spacing w:before="20" w:after="20"/>
-              <w:jc w:val="right"/>
-            </w:pPr>
-            <w:r/>
-            <w:r>
-              <w:rPr>
-                <w:rFonts w:ascii="Arial" w:hAnsi="Arial" w:cs="Arial"/>
-                <w:b w:val="0"/>
-                <w:i w:val="0"/>
-                <w:sz w:val="17"/>
-              </w:rPr>
-              <w:t>8.71%</w:t>
+              <w:t>8.39%</w:t>
             </w:r>
           </w:p>
         </w:tc>
@@ -3014,7 +2878,7 @@
                 <w:i w:val="0"/>
                 <w:sz w:val="17"/>
               </w:rPr>
-              <w:t>714.65 kg</w:t>
+              <w:t>742.07 kg</w:t>
             </w:r>
           </w:p>
         </w:tc>
@@ -3058,7 +2922,7 @@
                 <w:i w:val="0"/>
                 <w:sz w:val="17"/>
               </w:rPr>
-              <w:t>35.73 kg</w:t>
+              <w:t>37.10 kg</w:t>
             </w:r>
           </w:p>
         </w:tc>
@@ -3102,7 +2966,7 @@
                 <w:i w:val="0"/>
                 <w:sz w:val="17"/>
               </w:rPr>
-              <w:t>750.38 kg</w:t>
+              <w:t>779.18 kg</w:t>
             </w:r>
           </w:p>
         </w:tc>
@@ -3192,7 +3056,7 @@
                 <w:i w:val="0"/>
                 <w:sz w:val="17"/>
               </w:rPr>
-              <w:t>4.65 kg/m²</w:t>
+              <w:t>4.83 kg/m²</w:t>
             </w:r>
           </w:p>
         </w:tc>
@@ -3269,12 +3133,8 @@
       </w:r>
     </w:p>
     <w:p>
-      <w:r>
-        <w:br w:type="page"/>
-      </w:r>
-    </w:p>
-    <w:p>
-      <w:pPr>
+      <w:pPr>
+        <w:pageBreakBefore/>
         <w:spacing w:before="160" w:after="80"/>
         <w:jc w:val="left"/>
       </w:pPr>
@@ -3965,12 +3825,8 @@
       </w:r>
     </w:p>
     <w:p>
-      <w:r>
-        <w:br w:type="page"/>
-      </w:r>
-    </w:p>
-    <w:p>
-      <w:pPr>
+      <w:pPr>
+        <w:pageBreakBefore/>
         <w:spacing w:before="160" w:after="80"/>
         <w:jc w:val="left"/>
       </w:pPr>
@@ -4275,7 +4131,7 @@
                 <w:i w:val="0"/>
                 <w:sz w:val="17"/>
               </w:rPr>
-              <w:t>46.48%</w:t>
+              <w:t>46.03%</w:t>
             </w:r>
           </w:p>
         </w:tc>
@@ -4403,7 +4259,7 @@
                 <w:i w:val="0"/>
                 <w:sz w:val="17"/>
               </w:rPr>
-              <w:t>27.55%</w:t>
+              <w:t>27.28%</w:t>
             </w:r>
           </w:p>
         </w:tc>
@@ -4447,7 +4303,7 @@
                 <w:i w:val="0"/>
                 <w:sz w:val="17"/>
               </w:rPr>
-              <w:t>Montén C 12" cal. 14 - larguero de techo LT-9, larguero de techo LT-7, larguero de techo LT-6, larguero de techo LT-5, larguero de techo LT-4, larguero de techo LT-3, larguero de techo LT-2, larguero de techo LT-1</w:t>
+              <w:t>Montén C 12" cal. 14 - larguero de techo LT-9, larguero de techo LT-7, larguero de techo LT-6, larguero de techo LT-4, larguero de techo LT-3, larguero de techo LT-2, larguero de techo LT-1</w:t>
             </w:r>
           </w:p>
         </w:tc>
@@ -4468,7 +4324,7 @@
                 <w:i w:val="0"/>
                 <w:sz w:val="17"/>
               </w:rPr>
-              <w:t>80.64</w:t>
+              <w:t>70.56</w:t>
             </w:r>
           </w:p>
         </w:tc>
@@ -4510,7 +4366,7 @@
                 <w:i w:val="0"/>
                 <w:sz w:val="17"/>
               </w:rPr>
-              <w:t>583.84</w:t>
+              <w:t>510.86</w:t>
             </w:r>
           </w:p>
         </w:tc>
@@ -4531,7 +4387,7 @@
                 <w:i w:val="0"/>
                 <w:sz w:val="17"/>
               </w:rPr>
-              <w:t>19.98%</w:t>
+              <w:t>17.31%</w:t>
             </w:r>
           </w:p>
         </w:tc>
@@ -4575,7 +4431,7 @@
                 <w:i w:val="0"/>
                 <w:sz w:val="17"/>
               </w:rPr>
-              <w:t>Montén C 12" cal. 12 - larguero de techo LT-8</w:t>
+              <w:t>Montén C 12" cal. 12 - larguero de techo LT-8, larguero de techo LT-5</w:t>
             </w:r>
           </w:p>
         </w:tc>
@@ -4596,7 +4452,7 @@
                 <w:i w:val="0"/>
                 <w:sz w:val="17"/>
               </w:rPr>
-              <w:t>10.08</w:t>
+              <w:t>20.16</w:t>
             </w:r>
           </w:p>
         </w:tc>
@@ -4638,7 +4494,7 @@
                 <w:i w:val="0"/>
                 <w:sz w:val="17"/>
               </w:rPr>
-              <w:t>101.90</w:t>
+              <w:t>203.80</w:t>
             </w:r>
           </w:p>
         </w:tc>
@@ -4659,7 +4515,7 @@
                 <w:i w:val="0"/>
                 <w:sz w:val="17"/>
               </w:rPr>
-              <w:t>3.49%</w:t>
+              <w:t>6.90%</w:t>
             </w:r>
           </w:p>
         </w:tc>
@@ -4787,7 +4643,7 @@
                 <w:i w:val="0"/>
                 <w:sz w:val="17"/>
               </w:rPr>
-              <w:t>2.50%</w:t>
+              <w:t>2.48%</w:t>
             </w:r>
           </w:p>
         </w:tc>
@@ -4918,7 +4774,7 @@
                 <w:i w:val="0"/>
                 <w:sz w:val="17"/>
               </w:rPr>
-              <w:t>2,922.54 kg</w:t>
+              <w:t>2,951.45 kg</w:t>
             </w:r>
           </w:p>
         </w:tc>
@@ -4962,7 +4818,7 @@
                 <w:i w:val="0"/>
                 <w:sz w:val="17"/>
               </w:rPr>
-              <w:t>146.13 kg</w:t>
+              <w:t>147.57 kg</w:t>
             </w:r>
           </w:p>
         </w:tc>
@@ -5006,7 +4862,7 @@
                 <w:i w:val="0"/>
                 <w:sz w:val="17"/>
               </w:rPr>
-              <w:t>3,068.66 kg</w:t>
+              <w:t>3,099.03 kg</w:t>
             </w:r>
           </w:p>
         </w:tc>
@@ -5096,7 +4952,7 @@
                 <w:i w:val="0"/>
                 <w:sz w:val="17"/>
               </w:rPr>
-              <w:t>19.03 kg/m²</w:t>
+              <w:t>19.22 kg/m²</w:t>
             </w:r>
           </w:p>
         </w:tc>
@@ -5173,12 +5029,8 @@
       </w:r>
     </w:p>
     <w:p>
-      <w:r>
-        <w:br w:type="page"/>
-      </w:r>
-    </w:p>
-    <w:p>
-      <w:pPr>
+      <w:pPr>
+        <w:pageBreakBefore/>
         <w:spacing w:before="160" w:after="80"/>
         <w:jc w:val="left"/>
       </w:pPr>
@@ -5997,12 +5849,8 @@
       </w:r>
     </w:p>
     <w:p>
-      <w:r>
-        <w:br w:type="page"/>
-      </w:r>
-    </w:p>
-    <w:p>
-      <w:pPr>
+      <w:pPr>
+        <w:pageBreakBefore/>
         <w:spacing w:before="160" w:after="80"/>
         <w:jc w:val="left"/>
       </w:pPr>
@@ -6949,12 +6797,8 @@
       </w:r>
     </w:p>
     <w:p>
-      <w:r>
-        <w:br w:type="page"/>
-      </w:r>
-    </w:p>
-    <w:p>
-      <w:pPr>
+      <w:pPr>
+        <w:pageBreakBefore/>
         <w:spacing w:before="160" w:after="80"/>
         <w:jc w:val="left"/>
       </w:pPr>
@@ -7151,7 +6995,7 @@
                 <w:i w:val="0"/>
                 <w:sz w:val="17"/>
               </w:rPr>
-              <w:t>2,764.40</w:t>
+              <w:t>2,988.43</w:t>
             </w:r>
           </w:p>
         </w:tc>
@@ -7172,7 +7016,7 @@
                 <w:i w:val="0"/>
                 <w:sz w:val="17"/>
               </w:rPr>
-              <w:t>138.22</w:t>
+              <w:t>149.42</w:t>
             </w:r>
           </w:p>
         </w:tc>
@@ -7193,7 +7037,7 @@
                 <w:i w:val="0"/>
                 <w:sz w:val="17"/>
               </w:rPr>
-              <w:t>2,902.61</w:t>
+              <w:t>3,137.85</w:t>
             </w:r>
           </w:p>
         </w:tc>
@@ -7214,7 +7058,7 @@
                 <w:i w:val="0"/>
                 <w:sz w:val="17"/>
               </w:rPr>
-              <w:t>18.00</w:t>
+              <w:t>19.46</w:t>
             </w:r>
           </w:p>
         </w:tc>
@@ -7258,7 +7102,7 @@
                 <w:i w:val="0"/>
                 <w:sz w:val="17"/>
               </w:rPr>
-              <w:t>714.65</w:t>
+              <w:t>742.07</w:t>
             </w:r>
           </w:p>
         </w:tc>
@@ -7279,7 +7123,7 @@
                 <w:i w:val="0"/>
                 <w:sz w:val="17"/>
               </w:rPr>
-              <w:t>35.73</w:t>
+              <w:t>37.10</w:t>
             </w:r>
           </w:p>
         </w:tc>
@@ -7300,7 +7144,7 @@
                 <w:i w:val="0"/>
                 <w:sz w:val="17"/>
               </w:rPr>
-              <w:t>750.38</w:t>
+              <w:t>779.18</w:t>
             </w:r>
           </w:p>
         </w:tc>
@@ -7321,7 +7165,7 @@
                 <w:i w:val="0"/>
                 <w:sz w:val="17"/>
               </w:rPr>
-              <w:t>4.65</w:t>
+              <w:t>4.83</w:t>
             </w:r>
           </w:p>
         </w:tc>
@@ -7472,7 +7316,7 @@
                 <w:i w:val="0"/>
                 <w:sz w:val="17"/>
               </w:rPr>
-              <w:t>2,922.54</w:t>
+              <w:t>2,951.45</w:t>
             </w:r>
           </w:p>
         </w:tc>
@@ -7493,7 +7337,7 @@
                 <w:i w:val="0"/>
                 <w:sz w:val="17"/>
               </w:rPr>
-              <w:t>146.13</w:t>
+              <w:t>147.57</w:t>
             </w:r>
           </w:p>
         </w:tc>
@@ -7514,7 +7358,7 @@
                 <w:i w:val="0"/>
                 <w:sz w:val="17"/>
               </w:rPr>
-              <w:t>3,068.66</w:t>
+              <w:t>3,099.03</w:t>
             </w:r>
           </w:p>
         </w:tc>
@@ -7535,7 +7379,7 @@
                 <w:i w:val="0"/>
                 <w:sz w:val="17"/>
               </w:rPr>
-              <w:t>19.03</w:t>
+              <w:t>19.22</w:t>
             </w:r>
           </w:p>
         </w:tc>
@@ -7795,7 +7639,7 @@
                 <w:i w:val="0"/>
                 <w:sz w:val="17"/>
               </w:rPr>
-              <w:t>7,470.63</w:t>
+              <w:t>7,751.01</w:t>
             </w:r>
           </w:p>
         </w:tc>
@@ -7817,7 +7661,7 @@
                 <w:i w:val="0"/>
                 <w:sz w:val="17"/>
               </w:rPr>
-              <w:t>373.53</w:t>
+              <w:t>387.55</w:t>
             </w:r>
           </w:p>
         </w:tc>
@@ -7839,7 +7683,7 @@
                 <w:i w:val="0"/>
                 <w:sz w:val="17"/>
               </w:rPr>
-              <w:t>7,844.16</w:t>
+              <w:t>8,138.56</w:t>
             </w:r>
           </w:p>
         </w:tc>
@@ -7861,7 +7705,7 @@
                 <w:i w:val="0"/>
                 <w:sz w:val="17"/>
               </w:rPr>
-              <w:t>48.64</w:t>
+              <w:t>50.46</w:t>
             </w:r>
           </w:p>
         </w:tc>
@@ -7992,7 +7836,7 @@
                 <w:i w:val="0"/>
                 <w:sz w:val="17"/>
               </w:rPr>
-              <w:t>7,470.63 kg</w:t>
+              <w:t>7,751.01 kg</w:t>
             </w:r>
           </w:p>
         </w:tc>
@@ -8036,7 +7880,7 @@
                 <w:i w:val="0"/>
                 <w:sz w:val="17"/>
               </w:rPr>
-              <w:t>373.53 kg</w:t>
+              <w:t>387.55 kg</w:t>
             </w:r>
           </w:p>
         </w:tc>
@@ -8082,7 +7926,7 @@
                 <w:i w:val="0"/>
                 <w:sz w:val="17"/>
               </w:rPr>
-              <w:t>7,844.16 kg</w:t>
+              <w:t>8,138.56 kg</w:t>
             </w:r>
           </w:p>
         </w:tc>
@@ -8172,7 +8016,7 @@
                 <w:i w:val="0"/>
                 <w:sz w:val="17"/>
               </w:rPr>
-              <w:t>48.64 kg/m²</w:t>
+              <w:t>50.46 kg/m²</w:t>
             </w:r>
           </w:p>
         </w:tc>

</xml_diff>

<commit_message>
002 2.1: columnas del eje 3 en HSST8X8X0.125 con viga MCE10-14
La viga de marco del eje 3 pasa de MCE5-14 a MCE10-14 para que la columna
de 8x8x1/8 cumpla flecha (0.965 de L/180). CUT OFF 47, factores X 1.1482 /
Z 1.2900. 7642.1 kg, 49.75 kg/m2 con 5% de conexiones.

Co-Authored-By: Claude Opus 5.5 <noreply@anthropic.com>
Claude-Session: https://claude.ai/code/session_01DbpSpoM7qi5cJ9LMKpwgVv
</commit_message>
<xml_diff>
--- a/002/002_DESTRUCTURAL_H5H6_2.1.docx
+++ b/002/002_DESTRUCTURAL_H5H6_2.1.docx
@@ -263,7 +263,7 @@
                 <w:i w:val="0"/>
                 <w:sz w:val="17"/>
               </w:rPr>
-              <w:t>7,751.01 kg</w:t>
+              <w:t>7,642.07 kg</w:t>
             </w:r>
           </w:p>
         </w:tc>
@@ -349,7 +349,7 @@
                 <w:i w:val="0"/>
                 <w:sz w:val="17"/>
               </w:rPr>
-              <w:t>387.55 kg</w:t>
+              <w:t>382.10 kg</w:t>
             </w:r>
           </w:p>
         </w:tc>
@@ -395,7 +395,7 @@
                 <w:i w:val="0"/>
                 <w:sz w:val="17"/>
               </w:rPr>
-              <w:t>8,138.56 kg</w:t>
+              <w:t>8,024.18 kg</w:t>
             </w:r>
           </w:p>
         </w:tc>
@@ -439,7 +439,7 @@
                 <w:i w:val="0"/>
                 <w:sz w:val="17"/>
               </w:rPr>
-              <w:t>50.46 kg/m²</w:t>
+              <w:t>49.75 kg/m²</w:t>
             </w:r>
           </w:p>
         </w:tc>
@@ -483,7 +483,7 @@
                 <w:i w:val="0"/>
                 <w:sz w:val="17"/>
               </w:rPr>
-              <w:t>46</w:t>
+              <w:t>47</w:t>
             </w:r>
           </w:p>
         </w:tc>
@@ -525,7 +525,7 @@
                 <w:i w:val="0"/>
                 <w:sz w:val="17"/>
               </w:rPr>
-              <w:t>91.69 %</w:t>
+              <w:t>91.89 %</w:t>
             </w:r>
           </w:p>
         </w:tc>
@@ -569,7 +569,7 @@
                 <w:i w:val="0"/>
                 <w:sz w:val="17"/>
               </w:rPr>
-              <w:t>92.48 %</w:t>
+              <w:t>92.58 %</w:t>
             </w:r>
           </w:p>
         </w:tc>
@@ -655,7 +655,7 @@
                 <w:i w:val="0"/>
                 <w:sz w:val="17"/>
               </w:rPr>
-              <w:t>1.1531</w:t>
+              <w:t>1.1482</w:t>
             </w:r>
           </w:p>
         </w:tc>
@@ -697,7 +697,7 @@
                 <w:i w:val="0"/>
                 <w:sz w:val="17"/>
               </w:rPr>
-              <w:t>1.3975</w:t>
+              <w:t>1.2900</w:t>
             </w:r>
           </w:p>
         </w:tc>
@@ -801,7 +801,7 @@
           <w:i/>
           <w:sz w:val="16"/>
         </w:rPr>
-        <w:t>Peso de elementos: longitudes del modelo × peso unitario de cada sección (mismo criterio que el STEEL MEMBER TAKE OFF de STAAD, con todos los miembros). Conexiones: 5 %. Factores del espectro de la hoja de sismo con el peso dinámico de 13,470.77 kg (modos del motor de análisis; se confirman con la corrida de STAAD).</w:t>
+        <w:t>Peso de elementos: longitudes del modelo × peso unitario de cada sección (mismo criterio que el STEEL MEMBER TAKE OFF de STAAD, con todos los miembros). Conexiones: 5 %. Factores del espectro de la hoja de sismo con el peso dinámico de 13,367.14 kg (modos del motor de análisis; se confirman con la corrida de STAAD).</w:t>
       </w:r>
     </w:p>
     <w:p>
@@ -831,7 +831,7 @@
           <w:i w:val="0"/>
           <w:sz w:val="17"/>
         </w:rPr>
-        <w:t>•  Columnas HSS en 3 pares: eje 1 HSST12X12X0.25, eje 2 HSST10X10X0.313, eje 3 HSST8X8X0.188.</w:t>
+        <w:t>•  Columnas HSS en 3 pares: eje 1 HSST12X12X0.25, eje 2 HSST10X10X0.313, eje 3 HSST8X8X0.125.</w:t>
       </w:r>
     </w:p>
     <w:p>
@@ -846,7 +846,7 @@
           <w:i w:val="0"/>
           <w:sz w:val="17"/>
         </w:rPr>
-        <w:t>•  Vigas de marco espalda con espalda: eje 1 MCE4-14, eje 2 MCE12-14, eje 3 MCE5-14; dinteles MCC10-14; vigas de alero MCE12-14.</w:t>
+        <w:t>•  Vigas de marco espalda con espalda: eje 1 MCE4-14, eje 2 MCE12-14, eje 3 MCE10-14; dinteles MCC10-14; vigas de alero MCE12-14.</w:t>
       </w:r>
     </w:p>
     <w:p>
@@ -921,7 +921,7 @@
           <w:i w:val="0"/>
           <w:sz w:val="17"/>
         </w:rPr>
-        <w:t>•  Revisión: ratio máximo 0.97, flecha máxima 0.89 de L/180 y deriva máxima 0.0186 (≤ 0.020 con Cd = 6); CUT OFF MODE SHAPE 46.</w:t>
+        <w:t>•  Revisión: ratio máximo 0.95, flecha máxima 0.96 de L/180 y deriva máxima 0.0182 (≤ 0.020 con Cd = 6); CUT OFF MODE SHAPE 47.</w:t>
       </w:r>
     </w:p>
     <w:p>
@@ -1287,7 +1287,7 @@
                 <w:i w:val="0"/>
                 <w:sz w:val="17"/>
               </w:rPr>
-              <w:t>38.10%</w:t>
+              <w:t>40.39%</w:t>
             </w:r>
           </w:p>
         </w:tc>
@@ -1415,7 +1415,7 @@
                 <w:i w:val="0"/>
                 <w:sz w:val="17"/>
               </w:rPr>
-              <w:t>37.21%</w:t>
+              <w:t>39.45%</w:t>
             </w:r>
           </w:p>
         </w:tc>
@@ -1438,7 +1438,7 @@
                 <w:i w:val="0"/>
                 <w:sz w:val="17"/>
               </w:rPr>
-              <w:t>HSST8X8X0.188</w:t>
+              <w:t>HSST8X8X0.125</w:t>
             </w:r>
           </w:p>
         </w:tc>
@@ -1459,7 +1459,7 @@
                 <w:i w:val="0"/>
                 <w:sz w:val="17"/>
               </w:rPr>
-              <w:t>HSS 8"x8"x3/16" - columnas eje 3</w:t>
+              <w:t>HSS 8"x8"x1/8" - columnas eje 3</w:t>
             </w:r>
           </w:p>
         </w:tc>
@@ -1501,7 +1501,7 @@
                 <w:i w:val="0"/>
                 <w:sz w:val="17"/>
               </w:rPr>
-              <w:t>27.14</w:t>
+              <w:t>18.29</w:t>
             </w:r>
           </w:p>
         </w:tc>
@@ -1522,7 +1522,7 @@
                 <w:i w:val="0"/>
                 <w:sz w:val="17"/>
               </w:rPr>
-              <w:t>521.07</w:t>
+              <w:t>351.26</w:t>
             </w:r>
           </w:p>
         </w:tc>
@@ -1543,7 +1543,7 @@
                 <w:i w:val="0"/>
                 <w:sz w:val="17"/>
               </w:rPr>
-              <w:t>17.44%</w:t>
+              <w:t>12.46%</w:t>
             </w:r>
           </w:p>
         </w:tc>
@@ -1671,7 +1671,7 @@
                 <w:i w:val="0"/>
                 <w:sz w:val="17"/>
               </w:rPr>
-              <w:t>5.94%</w:t>
+              <w:t>6.29%</w:t>
             </w:r>
           </w:p>
         </w:tc>
@@ -1799,7 +1799,7 @@
                 <w:i w:val="0"/>
                 <w:sz w:val="17"/>
               </w:rPr>
-              <w:t>1.32%</w:t>
+              <w:t>1.40%</w:t>
             </w:r>
           </w:p>
         </w:tc>
@@ -1930,7 +1930,7 @@
                 <w:i w:val="0"/>
                 <w:sz w:val="17"/>
               </w:rPr>
-              <w:t>2,988.43 kg</w:t>
+              <w:t>2,818.62 kg</w:t>
             </w:r>
           </w:p>
         </w:tc>
@@ -1974,7 +1974,7 @@
                 <w:i w:val="0"/>
                 <w:sz w:val="17"/>
               </w:rPr>
-              <w:t>149.42 kg</w:t>
+              <w:t>140.93 kg</w:t>
             </w:r>
           </w:p>
         </w:tc>
@@ -2018,7 +2018,7 @@
                 <w:i w:val="0"/>
                 <w:sz w:val="17"/>
               </w:rPr>
-              <w:t>3,137.85 kg</w:t>
+              <w:t>2,959.55 kg</w:t>
             </w:r>
           </w:p>
         </w:tc>
@@ -2108,7 +2108,7 @@
                 <w:i w:val="0"/>
                 <w:sz w:val="17"/>
               </w:rPr>
-              <w:t>19.46 kg/m²</w:t>
+              <w:t>18.35 kg/m²</w:t>
             </w:r>
           </w:p>
         </w:tc>
@@ -2491,7 +2491,7 @@
                 <w:i w:val="0"/>
                 <w:sz w:val="17"/>
               </w:rPr>
-              <w:t>82.20%</w:t>
+              <w:t>75.96%</w:t>
             </w:r>
           </w:p>
         </w:tc>
@@ -2514,7 +2514,7 @@
                 <w:i w:val="0"/>
                 <w:sz w:val="17"/>
               </w:rPr>
-              <w:t>MCE5-14</w:t>
+              <w:t>MCE10-14</w:t>
             </w:r>
           </w:p>
         </w:tc>
@@ -2535,7 +2535,7 @@
                 <w:i w:val="0"/>
                 <w:sz w:val="17"/>
               </w:rPr>
-              <w:t>Montén doble 5" cal. 14 - viga de marco eje 3</w:t>
+              <w:t>Montén doble 10" cal. 14 - viga de marco eje 3</w:t>
             </w:r>
           </w:p>
         </w:tc>
@@ -2577,7 +2577,7 @@
                 <w:i w:val="0"/>
                 <w:sz w:val="17"/>
               </w:rPr>
-              <w:t>6.93</w:t>
+              <w:t>12.97</w:t>
             </w:r>
           </w:p>
         </w:tc>
@@ -2598,7 +2598,7 @@
                 <w:i w:val="0"/>
                 <w:sz w:val="17"/>
               </w:rPr>
-              <w:t>69.87</w:t>
+              <w:t>130.74</w:t>
             </w:r>
           </w:p>
         </w:tc>
@@ -2619,7 +2619,7 @@
                 <w:i w:val="0"/>
                 <w:sz w:val="17"/>
               </w:rPr>
-              <w:t>9.42%</w:t>
+              <w:t>16.28%</w:t>
             </w:r>
           </w:p>
         </w:tc>
@@ -2747,7 +2747,7 @@
                 <w:i w:val="0"/>
                 <w:sz w:val="17"/>
               </w:rPr>
-              <w:t>8.39%</w:t>
+              <w:t>7.75%</w:t>
             </w:r>
           </w:p>
         </w:tc>
@@ -2878,7 +2878,7 @@
                 <w:i w:val="0"/>
                 <w:sz w:val="17"/>
               </w:rPr>
-              <w:t>742.07 kg</w:t>
+              <w:t>802.95 kg</w:t>
             </w:r>
           </w:p>
         </w:tc>
@@ -2922,7 +2922,7 @@
                 <w:i w:val="0"/>
                 <w:sz w:val="17"/>
               </w:rPr>
-              <w:t>37.10 kg</w:t>
+              <w:t>40.15 kg</w:t>
             </w:r>
           </w:p>
         </w:tc>
@@ -2966,7 +2966,7 @@
                 <w:i w:val="0"/>
                 <w:sz w:val="17"/>
               </w:rPr>
-              <w:t>779.18 kg</w:t>
+              <w:t>843.09 kg</w:t>
             </w:r>
           </w:p>
         </w:tc>
@@ -3056,7 +3056,7 @@
                 <w:i w:val="0"/>
                 <w:sz w:val="17"/>
               </w:rPr>
-              <w:t>4.83 kg/m²</w:t>
+              <w:t>5.23 kg/m²</w:t>
             </w:r>
           </w:p>
         </w:tc>
@@ -6995,7 +6995,7 @@
                 <w:i w:val="0"/>
                 <w:sz w:val="17"/>
               </w:rPr>
-              <w:t>2,988.43</w:t>
+              <w:t>2,818.62</w:t>
             </w:r>
           </w:p>
         </w:tc>
@@ -7016,7 +7016,7 @@
                 <w:i w:val="0"/>
                 <w:sz w:val="17"/>
               </w:rPr>
-              <w:t>149.42</w:t>
+              <w:t>140.93</w:t>
             </w:r>
           </w:p>
         </w:tc>
@@ -7037,7 +7037,7 @@
                 <w:i w:val="0"/>
                 <w:sz w:val="17"/>
               </w:rPr>
-              <w:t>3,137.85</w:t>
+              <w:t>2,959.55</w:t>
             </w:r>
           </w:p>
         </w:tc>
@@ -7058,7 +7058,7 @@
                 <w:i w:val="0"/>
                 <w:sz w:val="17"/>
               </w:rPr>
-              <w:t>19.46</w:t>
+              <w:t>18.35</w:t>
             </w:r>
           </w:p>
         </w:tc>
@@ -7102,7 +7102,7 @@
                 <w:i w:val="0"/>
                 <w:sz w:val="17"/>
               </w:rPr>
-              <w:t>742.07</w:t>
+              <w:t>802.95</w:t>
             </w:r>
           </w:p>
         </w:tc>
@@ -7123,7 +7123,7 @@
                 <w:i w:val="0"/>
                 <w:sz w:val="17"/>
               </w:rPr>
-              <w:t>37.10</w:t>
+              <w:t>40.15</w:t>
             </w:r>
           </w:p>
         </w:tc>
@@ -7144,7 +7144,7 @@
                 <w:i w:val="0"/>
                 <w:sz w:val="17"/>
               </w:rPr>
-              <w:t>779.18</w:t>
+              <w:t>843.09</w:t>
             </w:r>
           </w:p>
         </w:tc>
@@ -7165,7 +7165,7 @@
                 <w:i w:val="0"/>
                 <w:sz w:val="17"/>
               </w:rPr>
-              <w:t>4.83</w:t>
+              <w:t>5.23</w:t>
             </w:r>
           </w:p>
         </w:tc>
@@ -7639,7 +7639,7 @@
                 <w:i w:val="0"/>
                 <w:sz w:val="17"/>
               </w:rPr>
-              <w:t>7,751.01</w:t>
+              <w:t>7,642.07</w:t>
             </w:r>
           </w:p>
         </w:tc>
@@ -7661,7 +7661,7 @@
                 <w:i w:val="0"/>
                 <w:sz w:val="17"/>
               </w:rPr>
-              <w:t>387.55</w:t>
+              <w:t>382.10</w:t>
             </w:r>
           </w:p>
         </w:tc>
@@ -7683,7 +7683,7 @@
                 <w:i w:val="0"/>
                 <w:sz w:val="17"/>
               </w:rPr>
-              <w:t>8,138.56</w:t>
+              <w:t>8,024.18</w:t>
             </w:r>
           </w:p>
         </w:tc>
@@ -7705,7 +7705,7 @@
                 <w:i w:val="0"/>
                 <w:sz w:val="17"/>
               </w:rPr>
-              <w:t>50.46</w:t>
+              <w:t>49.75</w:t>
             </w:r>
           </w:p>
         </w:tc>
@@ -7836,7 +7836,7 @@
                 <w:i w:val="0"/>
                 <w:sz w:val="17"/>
               </w:rPr>
-              <w:t>7,751.01 kg</w:t>
+              <w:t>7,642.07 kg</w:t>
             </w:r>
           </w:p>
         </w:tc>
@@ -7880,7 +7880,7 @@
                 <w:i w:val="0"/>
                 <w:sz w:val="17"/>
               </w:rPr>
-              <w:t>387.55 kg</w:t>
+              <w:t>382.10 kg</w:t>
             </w:r>
           </w:p>
         </w:tc>
@@ -7926,7 +7926,7 @@
                 <w:i w:val="0"/>
                 <w:sz w:val="17"/>
               </w:rPr>
-              <w:t>8,138.56 kg</w:t>
+              <w:t>8,024.18 kg</w:t>
             </w:r>
           </w:p>
         </w:tc>
@@ -8016,7 +8016,7 @@
                 <w:i w:val="0"/>
                 <w:sz w:val="17"/>
               </w:rPr>
-              <w:t>50.46 kg/m²</w:t>
+              <w:t>49.75 kg/m²</w:t>
             </w:r>
           </w:p>
         </w:tc>

</xml_diff>